<commit_message>
P2: clarify form 01 timing and signed-agreement references
</commit_message>
<xml_diff>
--- a/products-storage/02-dopraboty-bez-poter/01-prikaz-na-dopobem.docx
+++ b/products-storage/02-dopraboty-bez-poter/01-prikaz-na-dopobem.docx
@@ -13,7 +13,7 @@
     </w:p>
     <w:p>
       <w:r>
-        <w:t>Укажите только работы за пределами исходного объёма. Поручение и согласование условий оформляются уполномоченными представителями сторон с привязкой к договору и приложениям.</w:t>
+        <w:t>Оформите поручение до начала соответствующих работ. Укажите только работы за пределами исходного объёма; решение подписывают уполномоченные представители сторон с привязкой к договору и приложениям.</w:t>
       </w:r>
     </w:p>
     <w:p>
@@ -1140,7 +1140,7 @@
     </w:tbl>
     <w:p>
       <w:r>
-        <w:t>Если цена, срок или другие условия договора меняются, оформите соответствующее соглашение сторон. Это поручение фиксирует задание и его источник; заполненные ссылки указывают, какие условия согласованы отдельно.</w:t>
+        <w:t>Если цена, срок или другие условия договора меняются, оформите соответствующее соглашение сторон. Поручение фиксирует задание и его источник. Реквизиты соглашений 11 и 12 дополните после их подписания; указывайте только фактически подготовленные документы.</w:t>
       </w:r>
     </w:p>
     <w:p>

</xml_diff>

<commit_message>
Clarify signed instruction references in P2 form 01
</commit_message>
<xml_diff>
--- a/products-storage/02-dopraboty-bez-poter/01-prikaz-na-dopobem.docx
+++ b/products-storage/02-dopraboty-bez-poter/01-prikaz-na-dopobem.docx
@@ -1040,7 +1040,7 @@
                 <w:color w:val="262F37"/>
                 <w:sz w:val="18"/>
               </w:rPr>
-              <w:t>Влияние на этапы [___]; обоснование 05 № [___]; соглашение 12 № [___]</w:t>
+              <w:t>Влияние на этапы [___]; обоснование 05 № [___] от [___]; соглашение 12 № [___] от [___]</w:t>
             </w:r>
           </w:p>
         </w:tc>
@@ -1140,7 +1140,7 @@
     </w:tbl>
     <w:p>
       <w:r>
-        <w:t>Если цена, срок или другие условия договора меняются, оформите соответствующее соглашение сторон. Поручение фиксирует задание и его источник. Реквизиты соглашений 11 и 12 дополните после их подписания; указывайте только фактически подготовленные документы.</w:t>
+        <w:t>Если цена, срок или другие условия договора меняются, оформите соответствующее соглашение сторон. Поручение фиксирует задание и его источник. Ссылки на соглашения 11 и 12 укажите, только если они подписаны до подписания поручения. Подписанное поручение позднее не дополняйте: ссылку на него внесите в соглашение 11 и журнал 08.</w:t>
       </w:r>
     </w:p>
     <w:p>

</xml_diff>

<commit_message>
Clarify signed instruction references in P2 form 01 (#554)
</commit_message>
<xml_diff>
--- a/products-storage/02-dopraboty-bez-poter/01-prikaz-na-dopobem.docx
+++ b/products-storage/02-dopraboty-bez-poter/01-prikaz-na-dopobem.docx
@@ -1040,7 +1040,7 @@
                 <w:color w:val="262F37"/>
                 <w:sz w:val="18"/>
               </w:rPr>
-              <w:t>Влияние на этапы [___]; обоснование 05 № [___]; соглашение 12 № [___]</w:t>
+              <w:t>Влияние на этапы [___]; обоснование 05 № [___] от [___]; соглашение 12 № [___] от [___]</w:t>
             </w:r>
           </w:p>
         </w:tc>
@@ -1140,7 +1140,7 @@
     </w:tbl>
     <w:p>
       <w:r>
-        <w:t>Если цена, срок или другие условия договора меняются, оформите соответствующее соглашение сторон. Поручение фиксирует задание и его источник. Реквизиты соглашений 11 и 12 дополните после их подписания; указывайте только фактически подготовленные документы.</w:t>
+        <w:t>Если цена, срок или другие условия договора меняются, оформите соответствующее соглашение сторон. Поручение фиксирует задание и его источник. Ссылки на соглашения 11 и 12 укажите, только если они подписаны до подписания поручения. Подписанное поручение позднее не дополняйте: ссылку на него внесите в соглашение 11 и журнал 08.</w:t>
       </w:r>
     </w:p>
     <w:p>

</xml_diff>